<commit_message>
add schedule to AP ppt
</commit_message>
<xml_diff>
--- a/P(Path)/AP(ArtAcademicPath)/莱茵之路-德国名校体验与申请.docx
+++ b/P(Path)/AP(ArtAcademicPath)/莱茵之路-德国名校体验与申请.docx
@@ -123,7 +123,6 @@
     <w:p>
       <w:pPr>
         <w:rPr>
-          <w:rFonts w:hint="eastAsia"/>
           <w:lang w:val="de-DE"/>
         </w:rPr>
       </w:pPr>
@@ -143,13 +142,6 @@
       </w:r>
       <w:r>
         <w:rPr>
-          <w:rFonts w:hint="eastAsia"/>
-          <w:lang w:val="de-DE"/>
-        </w:rPr>
-        <w:t>法兰克福</w:t>
-      </w:r>
-      <w:r>
-        <w:rPr>
           <w:lang w:val="de-DE"/>
         </w:rPr>
         <w:t>Leonardo Royal Hotel Frankfurt</w:t>
@@ -533,7 +525,6 @@
     <w:p>
       <w:pPr>
         <w:rPr>
-          <w:rFonts w:hint="eastAsia"/>
           <w:lang w:val="de-DE"/>
         </w:rPr>
       </w:pPr>
@@ -826,7 +817,7 @@
     <w:p>
       <w:pPr>
         <w:rPr>
-          <w:lang w:val="en-GB"/>
+          <w:lang w:val="de-DE"/>
         </w:rPr>
       </w:pPr>
       <w:r>
@@ -847,16 +838,22 @@
     <w:p>
       <w:pPr>
         <w:rPr>
-          <w:rFonts w:hint="eastAsia"/>
-          <w:lang w:val="de-DE"/>
-        </w:rPr>
-      </w:pPr>
-      <w:r>
-        <w:rPr>
-          <w:rFonts w:hint="eastAsia"/>
-          <w:lang w:val="en-GB"/>
-        </w:rPr>
-        <w:t>下午：</w:t>
+          <w:lang w:val="de-DE"/>
+        </w:rPr>
+      </w:pPr>
+      <w:r>
+        <w:rPr>
+          <w:rFonts w:hint="eastAsia"/>
+          <w:lang w:val="en-GB"/>
+        </w:rPr>
+        <w:t>下午</w:t>
+      </w:r>
+      <w:r>
+        <w:rPr>
+          <w:rFonts w:hint="eastAsia"/>
+          <w:lang w:val="de-DE"/>
+        </w:rPr>
+        <w:t>：</w:t>
       </w:r>
       <w:r>
         <w:rPr>
@@ -1912,7 +1909,6 @@
     <w:p>
       <w:pPr>
         <w:rPr>
-          <w:rFonts w:hint="eastAsia"/>
           <w:lang w:val="en-GB"/>
         </w:rPr>
       </w:pPr>

</xml_diff>